<commit_message>
Update TCS resume: remove experience, restore summary
Drop work experience to match the application form, restore the
original analytics summary, and simplify the chess achievement line.

Co-authored-by: Anannya Rai Paul <anannyarp12@users.noreply.github.com>
</commit_message>
<xml_diff>
--- a/resume/Ananya_Rai_Paul_Resume_TCS.docx
+++ b/resume/Ananya_Rai_Paul_Resume_TCS.docx
@@ -40,7 +40,7 @@
           <w:b/>
           <w:sz w:val="22"/>
         </w:rPr>
-        <w:t>CAREER OBJECTIVE</w:t>
+        <w:t>SUMMARY</w:t>
       </w:r>
     </w:p>
     <w:p>
@@ -53,7 +53,7 @@
           <w:b w:val="0"/>
           <w:sz w:val="20"/>
         </w:rPr>
-        <w:t>B.Sc. Statistics (Honours) fresher seeking an entry-level role at TCS. Skilled in SQL, Python (working knowledge), Excel, and Power BI, with strong statistical foundations, problem-solving ability, and clear English communication. Eager to contribute to data analysis, reporting, and technology-driven business solutions while learning in a structured corporate environment.</w:t>
+        <w:t>B.Sc. Statistics (Honours) graduate with hands-on experience turning large datasets into actionable business insight using SQL, Excel, and Power BI including revenue trends, customer behavior patterns, and performance dashboards. Interested in applying analytical rigor to growth and marketing problems: understanding user behavior, campaign performance, and what drives retention and monetization.</w:t>
       </w:r>
     </w:p>
     <w:p>
@@ -391,71 +391,6 @@
           <w:b/>
           <w:sz w:val="22"/>
         </w:rPr>
-        <w:t>WORK EXPERIENCE</w:t>
-      </w:r>
-    </w:p>
-    <w:p>
-      <w:pPr>
-        <w:spacing w:after="0" w:before="0"/>
-      </w:pPr>
-      <w:r>
-        <w:rPr>
-          <w:rFonts w:ascii="Calibri" w:hAnsi="Calibri"/>
-          <w:b/>
-          <w:sz w:val="20"/>
-        </w:rPr>
-        <w:t>Guide, Translator and Operations Coordinator</w:t>
-      </w:r>
-    </w:p>
-    <w:p>
-      <w:pPr>
-        <w:spacing w:after="20" w:before="0"/>
-      </w:pPr>
-      <w:r>
-        <w:rPr>
-          <w:rFonts w:ascii="Calibri" w:hAnsi="Calibri"/>
-          <w:b w:val="0"/>
-          <w:sz w:val="18"/>
-        </w:rPr>
-        <w:t>Neora Valley Jungle Camp, Kolakham, Kalimpong | 1 Year</w:t>
-      </w:r>
-    </w:p>
-    <w:p>
-      <w:pPr>
-        <w:pStyle w:val="ListBullet"/>
-        <w:spacing w:after="20"/>
-      </w:pPr>
-      <w:r>
-        <w:rPr>
-          <w:rFonts w:ascii="Calibri" w:hAnsi="Calibri"/>
-          <w:sz w:val="20"/>
-        </w:rPr>
-        <w:t>Handled communication with international guests and coordinated day-to-day operations under pressure</w:t>
-      </w:r>
-    </w:p>
-    <w:p>
-      <w:pPr>
-        <w:pStyle w:val="ListBullet"/>
-        <w:spacing w:after="20"/>
-      </w:pPr>
-      <w:r>
-        <w:rPr>
-          <w:rFonts w:ascii="Calibri" w:hAnsi="Calibri"/>
-          <w:sz w:val="20"/>
-        </w:rPr>
-        <w:t>Improved planning, documentation, and problem-solving skills transferable to client and team environments</w:t>
-      </w:r>
-    </w:p>
-    <w:p>
-      <w:pPr>
-        <w:spacing w:after="40" w:before="160"/>
-      </w:pPr>
-      <w:r>
-        <w:rPr>
-          <w:rFonts w:ascii="Calibri" w:hAnsi="Calibri"/>
-          <w:b/>
-          <w:sz w:val="22"/>
-        </w:rPr>
         <w:t>CERTIFICATIONS</w:t>
       </w:r>
     </w:p>
@@ -508,7 +443,7 @@
           <w:rFonts w:ascii="Calibri" w:hAnsi="Calibri"/>
           <w:sz w:val="20"/>
         </w:rPr>
-        <w:t>Represented school in the men's chess competition in Class 10, building focus and strategic thinking</w:t>
+        <w:t>Represented school in the chess competition in Class 10, building focus and strategic thinking</w:t>
       </w:r>
     </w:p>
     <w:sectPr>

</xml_diff>